<commit_message>
feat: add ContractPreviewScreen and docx generation utility with related template assets
</commit_message>
<xml_diff>
--- a/src/assets/templates/CT01.docx
+++ b/src/assets/templates/CT01.docx
@@ -223,19 +223,64 @@
         <w:t>TỜ KHAI THAY ĐỔI THÔNG TIN CƯ TRÚ</w:t>
       </w:r>
     </w:p>
-    <w:p xmlns:wp14="http://schemas.microsoft.com/office/word/2010/wordml" wp14:textId="76E84ECC">
+    <w:p xmlns:wp14="http://schemas.microsoft.com/office/word/2010/wordml" wp14:textId="6811DB13">
       <w:pPr>
+        <w:pStyle w:val="Normal"/>
         <w:suppressAutoHyphens w:val="0"/>
         <w:spacing w:before="160" w:after="160"/>
         <w:ind w:firstLine="567"/>
         <w:rPr>
+          <w:rFonts w:ascii="Consolas" w:hAnsi="Consolas" w:eastAsia="Consolas" w:cs="Consolas"/>
+          <w:b w:val="0"/>
+          <w:bCs w:val="0"/>
+          <w:i w:val="0"/>
+          <w:iCs w:val="0"/>
+          <w:caps w:val="0"/>
+          <w:smallCaps w:val="0"/>
+          <w:noProof w:val="0"/>
+          <w:color w:val="D0D0D0"/>
           <w:spacing w:val="-8"/>
+          <w:sz w:val="17"/>
+          <w:szCs w:val="17"/>
+          <w:lang w:val="en-US"/>
+        </w:rPr>
+      </w:pPr>
+      <w:r>
+        <w:rPr>
+          <w:spacing w:val="-8"/>
+          <w:sz w:val="26"/>
+          <w:szCs w:val="26"/>
+          <w:lang w:eastAsia="en-US"/>
+        </w:rPr>
+        <w:t>Kính</w:t>
+      </w:r>
+      <w:r>
+        <w:rPr>
+          <w:spacing w:val="-8"/>
+          <w:sz w:val="26"/>
+          <w:szCs w:val="26"/>
+          <w:lang w:eastAsia="en-US"/>
+        </w:rPr>
+        <w:t xml:space="preserve"> </w:t>
+      </w:r>
+      <w:r>
+        <w:rPr>
+          <w:spacing w:val="-8"/>
+          <w:sz w:val="26"/>
+          <w:szCs w:val="26"/>
+          <w:lang w:eastAsia="en-US"/>
+        </w:rPr>
+        <w:t>gửi</w:t>
+      </w:r>
+      <w:r>
+        <w:rPr>
           <w:sz w:val="26"/>
           <w:szCs w:val="26"/>
           <w:vertAlign w:val="superscript"/>
           <w:lang w:eastAsia="en-US"/>
         </w:rPr>
-      </w:pPr>
+        <w:t xml:space="preserve"> (1)</w:t>
+      </w:r>
       <w:r>
         <w:rPr>
           <w:spacing w:val="-8"/>
@@ -243,48 +288,18 @@
           <w:szCs w:val="26"/>
           <w:lang w:eastAsia="en-US"/>
         </w:rPr>
-        <w:t>Kính</w:t>
-      </w:r>
-      <w:r>
-        <w:rPr>
-          <w:spacing w:val="-8"/>
+        <w:t xml:space="preserve"> {</w:t>
+      </w:r>
+      <w:r>
+        <w:rPr>
           <w:sz w:val="26"/>
           <w:szCs w:val="26"/>
           <w:lang w:eastAsia="en-US"/>
         </w:rPr>
-        <w:t xml:space="preserve"> </w:t>
-      </w:r>
-      <w:r>
-        <w:rPr>
-          <w:spacing w:val="-8"/>
-          <w:sz w:val="26"/>
-          <w:szCs w:val="26"/>
-          <w:lang w:eastAsia="en-US"/>
-        </w:rPr>
-        <w:t>gửi</w:t>
-      </w:r>
-      <w:r>
-        <w:rPr>
-          <w:spacing w:val="-8"/>
-          <w:sz w:val="26"/>
-          <w:szCs w:val="26"/>
-          <w:vertAlign w:val="superscript"/>
-          <w:lang w:eastAsia="en-US"/>
-        </w:rPr>
-        <w:t>(1</w:t>
-      </w:r>
-      <w:r>
-        <w:rPr>
-          <w:spacing w:val="-8"/>
-          <w:sz w:val="26"/>
-          <w:szCs w:val="26"/>
-          <w:vertAlign w:val="superscript"/>
-          <w:lang w:eastAsia="en-US"/>
-        </w:rPr>
-        <w:t>: ....................................................................................................................................</w:t>
+        <w:t>authorityName}</w:t>
       </w:r>
     </w:p>
-    <w:p xmlns:wp14="http://schemas.microsoft.com/office/word/2010/wordml" wp14:textId="361F49B6">
+    <w:p xmlns:wp14="http://schemas.microsoft.com/office/word/2010/wordml" wp14:textId="486EC53F">
       <w:pPr>
         <w:tabs>
           <w:tab w:val="left" w:leader="dot" w:pos="9072"/>
@@ -293,8 +308,6 @@
         <w:spacing w:before="120" w:after="120"/>
         <w:rPr>
           <w:spacing w:val="-8"/>
-          <w:sz w:val="26"/>
-          <w:szCs w:val="26"/>
           <w:lang w:val="vi-VN" w:eastAsia="en-US"/>
         </w:rPr>
       </w:pPr>
@@ -317,10 +330,22 @@
         <w:rPr>
           <w:lang w:val="vi-VN" w:eastAsia="en-US"/>
         </w:rPr>
-        <w:t>..............................................................................................................</w:t>
+        <w:t xml:space="preserve"> {</w:t>
+      </w:r>
+      <w:r>
+        <w:rPr>
+          <w:lang w:val="vi-VN" w:eastAsia="en-US"/>
+        </w:rPr>
+        <w:t>fullName</w:t>
+      </w:r>
+      <w:r>
+        <w:rPr>
+          <w:lang w:val="vi-VN" w:eastAsia="en-US"/>
+        </w:rPr>
+        <w:t>}</w:t>
       </w:r>
     </w:p>
-    <w:p xmlns:wp14="http://schemas.microsoft.com/office/word/2010/wordml" wp14:textId="24112640">
+    <w:p xmlns:wp14="http://schemas.microsoft.com/office/word/2010/wordml" wp14:textId="7BD04350">
       <w:pPr>
         <w:tabs>
           <w:tab w:val="left" w:leader="dot" w:pos="9072"/>
@@ -346,7 +371,25 @@
         <w:rPr>
           <w:lang w:val="vi-VN" w:eastAsia="en-US"/>
         </w:rPr>
-        <w:t xml:space="preserve"> .................../............/....................     </w:t>
+        <w:t xml:space="preserve"> </w:t>
+      </w:r>
+      <w:r>
+        <w:rPr>
+          <w:lang w:val="vi-VN" w:eastAsia="en-US"/>
+        </w:rPr>
+        <w:t xml:space="preserve">{</w:t>
+      </w:r>
+      <w:r>
+        <w:rPr>
+          <w:lang w:val="vi-VN" w:eastAsia="en-US"/>
+        </w:rPr>
+        <w:t xml:space="preserve">dob</w:t>
+      </w:r>
+      <w:r>
+        <w:rPr>
+          <w:lang w:val="vi-VN" w:eastAsia="en-US"/>
+        </w:rPr>
+        <w:t xml:space="preserve">}</w:t>
       </w:r>
       <w:r>
         <w:rPr>
@@ -356,6 +399,12 @@
       </w:r>
       <w:r>
         <w:rPr>
+          <w:lang w:val="vi-VN" w:eastAsia="en-US"/>
+        </w:rPr>
+        <w:t xml:space="preserve">     </w:t>
+      </w:r>
+      <w:r>
+        <w:rPr>
           <w:spacing w:val="-8"/>
           <w:sz w:val="26"/>
           <w:szCs w:val="26"/>
@@ -370,7 +419,16 @@
           <w:szCs w:val="26"/>
           <w:lang w:val="vi-VN" w:eastAsia="en-US"/>
         </w:rPr>
-        <w:t xml:space="preserve"> .................</w:t>
+        <w:t xml:space="preserve"> </w:t>
+      </w:r>
+      <w:r>
+        <w:rPr>
+          <w:spacing w:val="-8"/>
+          <w:sz w:val="26"/>
+          <w:szCs w:val="26"/>
+          <w:lang w:val="vi-VN" w:eastAsia="en-US"/>
+        </w:rPr>
+        <w:t xml:space="preserve">{gender}</w:t>
       </w:r>
     </w:p>
     <w:tbl>
@@ -400,6 +458,7 @@
             <w:tcBorders>
               <w:right w:val="single" w:color="auto" w:sz="4" w:space="0"/>
             </w:tcBorders>
+            <w:tcMar/>
           </w:tcPr>
           <w:p wp14:textId="77777777">
             <w:pPr>
@@ -440,8 +499,9 @@
               <w:bottom w:val="single" w:color="auto" w:sz="4" w:space="0"/>
               <w:right w:val="single" w:color="auto" w:sz="4" w:space="0"/>
             </w:tcBorders>
-          </w:tcPr>
-          <w:p wp14:textId="77777777">
+            <w:tcMar/>
+          </w:tcPr>
+          <w:p wp14:textId="0364E853">
             <w:pPr>
               <w:tabs>
                 <w:tab w:val="left" w:leader="dot" w:pos="10206"/>
@@ -452,6 +512,12 @@
                 <w:lang w:val="pt-BR" w:eastAsia="en-US"/>
               </w:rPr>
             </w:pPr>
+            <w:r>
+              <w:rPr>
+                <w:lang w:val="pt-BR" w:eastAsia="en-US"/>
+              </w:rPr>
+              <w:t>{n1}</w:t>
+            </w:r>
           </w:p>
         </w:tc>
         <w:tc>
@@ -463,8 +529,9 @@
               <w:bottom w:val="single" w:color="auto" w:sz="4" w:space="0"/>
               <w:right w:val="single" w:color="auto" w:sz="4" w:space="0"/>
             </w:tcBorders>
-          </w:tcPr>
-          <w:p wp14:textId="77777777">
+            <w:tcMar/>
+          </w:tcPr>
+          <w:p wp14:textId="3D32EFD9">
             <w:pPr>
               <w:tabs>
                 <w:tab w:val="left" w:leader="dot" w:pos="10206"/>
@@ -475,6 +542,12 @@
                 <w:lang w:val="pt-BR" w:eastAsia="en-US"/>
               </w:rPr>
             </w:pPr>
+            <w:r>
+              <w:rPr>
+                <w:lang w:val="pt-BR" w:eastAsia="en-US"/>
+              </w:rPr>
+              <w:t>{n2}</w:t>
+            </w:r>
           </w:p>
         </w:tc>
         <w:tc>
@@ -486,8 +559,9 @@
               <w:bottom w:val="single" w:color="auto" w:sz="4" w:space="0"/>
               <w:right w:val="single" w:color="auto" w:sz="4" w:space="0"/>
             </w:tcBorders>
-          </w:tcPr>
-          <w:p wp14:textId="77777777">
+            <w:tcMar/>
+          </w:tcPr>
+          <w:p wp14:textId="21F6330C">
             <w:pPr>
               <w:tabs>
                 <w:tab w:val="left" w:leader="dot" w:pos="10206"/>
@@ -498,6 +572,12 @@
                 <w:lang w:val="pt-BR" w:eastAsia="en-US"/>
               </w:rPr>
             </w:pPr>
+            <w:r>
+              <w:rPr>
+                <w:lang w:val="pt-BR" w:eastAsia="en-US"/>
+              </w:rPr>
+              <w:t>{n3}</w:t>
+            </w:r>
           </w:p>
         </w:tc>
         <w:tc>
@@ -509,8 +589,9 @@
               <w:bottom w:val="single" w:color="auto" w:sz="4" w:space="0"/>
               <w:right w:val="single" w:color="auto" w:sz="4" w:space="0"/>
             </w:tcBorders>
-          </w:tcPr>
-          <w:p wp14:textId="77777777">
+            <w:tcMar/>
+          </w:tcPr>
+          <w:p wp14:textId="04F0BBAE">
             <w:pPr>
               <w:tabs>
                 <w:tab w:val="left" w:leader="dot" w:pos="10206"/>
@@ -521,6 +602,12 @@
                 <w:lang w:val="pt-BR" w:eastAsia="en-US"/>
               </w:rPr>
             </w:pPr>
+            <w:r>
+              <w:rPr>
+                <w:lang w:val="pt-BR" w:eastAsia="en-US"/>
+              </w:rPr>
+              <w:t>{n4}</w:t>
+            </w:r>
           </w:p>
         </w:tc>
         <w:tc>
@@ -532,8 +619,9 @@
               <w:bottom w:val="single" w:color="auto" w:sz="4" w:space="0"/>
               <w:right w:val="single" w:color="auto" w:sz="4" w:space="0"/>
             </w:tcBorders>
-          </w:tcPr>
-          <w:p wp14:textId="77777777">
+            <w:tcMar/>
+          </w:tcPr>
+          <w:p wp14:textId="4083CD81">
             <w:pPr>
               <w:tabs>
                 <w:tab w:val="left" w:leader="dot" w:pos="10206"/>
@@ -544,6 +632,12 @@
                 <w:lang w:val="pt-BR" w:eastAsia="en-US"/>
               </w:rPr>
             </w:pPr>
+            <w:r>
+              <w:rPr>
+                <w:lang w:val="pt-BR" w:eastAsia="en-US"/>
+              </w:rPr>
+              <w:t>{n5}</w:t>
+            </w:r>
           </w:p>
         </w:tc>
         <w:tc>
@@ -555,8 +649,9 @@
               <w:bottom w:val="single" w:color="auto" w:sz="4" w:space="0"/>
               <w:right w:val="single" w:color="auto" w:sz="4" w:space="0"/>
             </w:tcBorders>
-          </w:tcPr>
-          <w:p wp14:textId="77777777">
+            <w:tcMar/>
+          </w:tcPr>
+          <w:p wp14:textId="0F052F21">
             <w:pPr>
               <w:tabs>
                 <w:tab w:val="left" w:leader="dot" w:pos="10206"/>
@@ -567,6 +662,12 @@
                 <w:lang w:val="pt-BR" w:eastAsia="en-US"/>
               </w:rPr>
             </w:pPr>
+            <w:r>
+              <w:rPr>
+                <w:lang w:val="pt-BR" w:eastAsia="en-US"/>
+              </w:rPr>
+              <w:t>{n6}</w:t>
+            </w:r>
           </w:p>
         </w:tc>
         <w:tc>
@@ -578,8 +679,9 @@
               <w:bottom w:val="single" w:color="auto" w:sz="4" w:space="0"/>
               <w:right w:val="single" w:color="auto" w:sz="4" w:space="0"/>
             </w:tcBorders>
-          </w:tcPr>
-          <w:p wp14:textId="77777777">
+            <w:tcMar/>
+          </w:tcPr>
+          <w:p wp14:textId="39642A60">
             <w:pPr>
               <w:tabs>
                 <w:tab w:val="left" w:leader="dot" w:pos="10206"/>
@@ -590,6 +692,12 @@
                 <w:lang w:val="pt-BR" w:eastAsia="en-US"/>
               </w:rPr>
             </w:pPr>
+            <w:r>
+              <w:rPr>
+                <w:lang w:val="pt-BR" w:eastAsia="en-US"/>
+              </w:rPr>
+              <w:t>{n7}</w:t>
+            </w:r>
           </w:p>
         </w:tc>
         <w:tc>
@@ -601,8 +709,9 @@
               <w:bottom w:val="single" w:color="auto" w:sz="4" w:space="0"/>
               <w:right w:val="single" w:color="auto" w:sz="4" w:space="0"/>
             </w:tcBorders>
-          </w:tcPr>
-          <w:p wp14:textId="77777777">
+            <w:tcMar/>
+          </w:tcPr>
+          <w:p wp14:textId="231D55C3">
             <w:pPr>
               <w:tabs>
                 <w:tab w:val="left" w:leader="dot" w:pos="10206"/>
@@ -613,6 +722,12 @@
                 <w:lang w:val="pt-BR" w:eastAsia="en-US"/>
               </w:rPr>
             </w:pPr>
+            <w:r>
+              <w:rPr>
+                <w:lang w:val="pt-BR" w:eastAsia="en-US"/>
+              </w:rPr>
+              <w:t>{n8}</w:t>
+            </w:r>
           </w:p>
         </w:tc>
         <w:tc>
@@ -624,8 +739,9 @@
               <w:bottom w:val="single" w:color="auto" w:sz="4" w:space="0"/>
               <w:right w:val="single" w:color="auto" w:sz="4" w:space="0"/>
             </w:tcBorders>
-          </w:tcPr>
-          <w:p wp14:textId="77777777">
+            <w:tcMar/>
+          </w:tcPr>
+          <w:p wp14:textId="2CEC9E32">
             <w:pPr>
               <w:tabs>
                 <w:tab w:val="left" w:leader="dot" w:pos="10206"/>
@@ -636,6 +752,12 @@
                 <w:lang w:val="pt-BR" w:eastAsia="en-US"/>
               </w:rPr>
             </w:pPr>
+            <w:r>
+              <w:rPr>
+                <w:lang w:val="pt-BR" w:eastAsia="en-US"/>
+              </w:rPr>
+              <w:t>{n9}</w:t>
+            </w:r>
           </w:p>
         </w:tc>
         <w:tc>
@@ -647,8 +769,9 @@
               <w:bottom w:val="single" w:color="auto" w:sz="4" w:space="0"/>
               <w:right w:val="single" w:color="auto" w:sz="4" w:space="0"/>
             </w:tcBorders>
-          </w:tcPr>
-          <w:p wp14:textId="77777777">
+            <w:tcMar/>
+          </w:tcPr>
+          <w:p wp14:textId="303A4225">
             <w:pPr>
               <w:tabs>
                 <w:tab w:val="left" w:leader="dot" w:pos="10206"/>
@@ -659,6 +782,12 @@
                 <w:lang w:val="pt-BR" w:eastAsia="en-US"/>
               </w:rPr>
             </w:pPr>
+            <w:r>
+              <w:rPr>
+                <w:lang w:val="pt-BR" w:eastAsia="en-US"/>
+              </w:rPr>
+              <w:t>{n10}</w:t>
+            </w:r>
           </w:p>
         </w:tc>
         <w:tc>
@@ -670,8 +799,9 @@
               <w:bottom w:val="single" w:color="auto" w:sz="4" w:space="0"/>
               <w:right w:val="single" w:color="auto" w:sz="4" w:space="0"/>
             </w:tcBorders>
-          </w:tcPr>
-          <w:p wp14:textId="77777777">
+            <w:tcMar/>
+          </w:tcPr>
+          <w:p wp14:textId="3C56DD5A">
             <w:pPr>
               <w:tabs>
                 <w:tab w:val="left" w:leader="dot" w:pos="10206"/>
@@ -682,6 +812,12 @@
                 <w:lang w:val="pt-BR" w:eastAsia="en-US"/>
               </w:rPr>
             </w:pPr>
+            <w:r>
+              <w:rPr>
+                <w:lang w:val="pt-BR" w:eastAsia="en-US"/>
+              </w:rPr>
+              <w:t>{n11}</w:t>
+            </w:r>
           </w:p>
         </w:tc>
         <w:tc>
@@ -693,8 +829,9 @@
               <w:bottom w:val="single" w:color="auto" w:sz="4" w:space="0"/>
               <w:right w:val="single" w:color="auto" w:sz="4" w:space="0"/>
             </w:tcBorders>
-          </w:tcPr>
-          <w:p wp14:textId="77777777">
+            <w:tcMar/>
+          </w:tcPr>
+          <w:p wp14:textId="2A1387C2">
             <w:pPr>
               <w:tabs>
                 <w:tab w:val="left" w:leader="dot" w:pos="10206"/>
@@ -705,11 +842,17 @@
                 <w:lang w:val="pt-BR" w:eastAsia="en-US"/>
               </w:rPr>
             </w:pPr>
+            <w:r>
+              <w:rPr>
+                <w:lang w:val="pt-BR" w:eastAsia="en-US"/>
+              </w:rPr>
+              <w:t>{n12}</w:t>
+            </w:r>
           </w:p>
         </w:tc>
       </w:tr>
     </w:tbl>
-    <w:p xmlns:wp14="http://schemas.microsoft.com/office/word/2010/wordml" wp14:textId="5E8EBD5D">
+    <w:p xmlns:wp14="http://schemas.microsoft.com/office/word/2010/wordml" wp14:textId="5DA3F1CC">
       <w:pPr>
         <w:pStyle w:val="Normal"/>
         <w:suppressLineNumbers w:val="0"/>
@@ -799,7 +942,31 @@
         <w:rPr>
           <w:lang w:val="vi-VN" w:eastAsia="en-US"/>
         </w:rPr>
-        <w:t xml:space="preserve"> .................................................. </w:t>
+        <w:t xml:space="preserve"> </w:t>
+      </w:r>
+      <w:r>
+        <w:rPr>
+          <w:lang w:val="vi-VN" w:eastAsia="en-US"/>
+        </w:rPr>
+        <w:t>{</w:t>
+      </w:r>
+      <w:r>
+        <w:rPr>
+          <w:lang w:val="vi-VN" w:eastAsia="en-US"/>
+        </w:rPr>
+        <w:t>phone</w:t>
+      </w:r>
+      <w:r>
+        <w:rPr>
+          <w:lang w:val="vi-VN" w:eastAsia="en-US"/>
+        </w:rPr>
+        <w:t>}</w:t>
+      </w:r>
+      <w:r>
+        <w:rPr>
+          <w:lang w:val="vi-VN" w:eastAsia="en-US"/>
+        </w:rPr>
+        <w:t xml:space="preserve"> </w:t>
       </w:r>
       <w:r>
         <w:rPr>
@@ -835,11 +1002,12 @@
         <w:rPr>
           <w:lang w:val="vi-VN" w:eastAsia="en-US"/>
         </w:rPr>
-        <w:t>.........................................</w:t>
+        <w:t xml:space="preserve"> {email}</w:t>
       </w:r>
     </w:p>
-    <w:p xmlns:wp14="http://schemas.microsoft.com/office/word/2010/wordml" wp14:textId="0839A6F2">
+    <w:p xmlns:wp14="http://schemas.microsoft.com/office/word/2010/wordml" wp14:textId="5CFB74E8">
       <w:pPr>
+        <w:pStyle w:val="Normal"/>
         <w:tabs>
           <w:tab w:val="left" w:leader="dot" w:pos="5812"/>
           <w:tab w:val="left" w:leader="dot" w:pos="9072"/>
@@ -847,6 +1015,8 @@
         <w:suppressAutoHyphens w:val="0"/>
         <w:spacing w:before="120" w:after="120"/>
         <w:rPr>
+          <w:sz w:val="26"/>
+          <w:szCs w:val="26"/>
           <w:lang w:val="vi-VN" w:eastAsia="en-US"/>
         </w:rPr>
       </w:pPr>
@@ -874,23 +1044,57 @@
         <w:rPr>
           <w:lang w:val="vi-VN" w:eastAsia="en-US"/>
         </w:rPr>
-        <w:t xml:space="preserve">............................... </w:t>
-      </w:r>
-      <w:r>
-        <w:rPr>
-          <w:sz w:val="26"/>
-          <w:szCs w:val="26"/>
-          <w:lang w:val="vi-VN" w:eastAsia="en-US"/>
-        </w:rPr>
-        <w:t>8. Mối quan hệ với chủ hộ:</w:t>
-      </w:r>
-      <w:r>
-        <w:rPr>
-          <w:sz w:val="26"/>
-          <w:szCs w:val="26"/>
-          <w:lang w:val="vi-VN" w:eastAsia="en-US"/>
-        </w:rPr>
-        <w:t xml:space="preserve"> ...............</w:t>
+        <w:t xml:space="preserve"> {</w:t>
+      </w:r>
+      <w:r>
+        <w:rPr>
+          <w:lang w:val="vi-VN" w:eastAsia="en-US"/>
+        </w:rPr>
+        <w:t>householderName</w:t>
+      </w:r>
+      <w:r>
+        <w:rPr>
+          <w:lang w:val="vi-VN" w:eastAsia="en-US"/>
+        </w:rPr>
+        <w:t>}</w:t>
+      </w:r>
+      <w:r>
+        <w:rPr>
+          <w:lang w:val="vi-VN" w:eastAsia="en-US"/>
+        </w:rPr>
+        <w:t xml:space="preserve"> </w:t>
+      </w:r>
+      <w:r>
+        <w:rPr>
+          <w:sz w:val="26"/>
+          <w:szCs w:val="26"/>
+          <w:lang w:val="vi-VN" w:eastAsia="en-US"/>
+        </w:rPr>
+        <w:t>8. Mố</w:t>
+      </w:r>
+      <w:r>
+        <w:rPr>
+          <w:sz w:val="26"/>
+          <w:szCs w:val="26"/>
+          <w:lang w:val="vi-VN" w:eastAsia="en-US"/>
+        </w:rPr>
+        <w:t>i quan hệ với chủ hộ:</w:t>
+      </w:r>
+      <w:r>
+        <w:rPr>
+          <w:sz w:val="26"/>
+          <w:szCs w:val="26"/>
+          <w:lang w:val="vi-VN" w:eastAsia="en-US"/>
+        </w:rPr>
+        <w:t xml:space="preserve"> </w:t>
+      </w:r>
+      <w:r>
+        <w:rPr>
+          <w:sz w:val="26"/>
+          <w:szCs w:val="26"/>
+          <w:lang w:val="vi-VN" w:eastAsia="en-US"/>
+        </w:rPr>
+        <w:t>{relationshipToHouseholder}</w:t>
       </w:r>
     </w:p>
     <w:tbl>
@@ -923,6 +1127,7 @@
             <w:tcBorders>
               <w:right w:val="single" w:color="auto" w:sz="4" w:space="0"/>
             </w:tcBorders>
+            <w:tcMar/>
           </w:tcPr>
           <w:p wp14:textId="77777777">
             <w:pPr>
@@ -963,8 +1168,9 @@
               <w:bottom w:val="single" w:color="auto" w:sz="4" w:space="0"/>
               <w:right w:val="single" w:color="auto" w:sz="4" w:space="0"/>
             </w:tcBorders>
-          </w:tcPr>
-          <w:p wp14:textId="77777777">
+            <w:tcMar/>
+          </w:tcPr>
+          <w:p wp14:textId="5678A7F9">
             <w:pPr>
               <w:tabs>
                 <w:tab w:val="left" w:leader="dot" w:pos="10206"/>
@@ -975,6 +1181,24 @@
                 <w:lang w:val="vi-VN" w:eastAsia="en-US"/>
               </w:rPr>
             </w:pPr>
+            <w:r>
+              <w:rPr>
+                <w:lang w:val="vi-VN" w:eastAsia="en-US"/>
+              </w:rPr>
+              <w:t>{h</w:t>
+            </w:r>
+            <w:r>
+              <w:rPr>
+                <w:lang w:val="vi-VN" w:eastAsia="en-US"/>
+              </w:rPr>
+              <w:t>1</w:t>
+            </w:r>
+            <w:r>
+              <w:rPr>
+                <w:lang w:val="vi-VN" w:eastAsia="en-US"/>
+              </w:rPr>
+              <w:t>}</w:t>
+            </w:r>
           </w:p>
         </w:tc>
         <w:tc>
@@ -986,8 +1210,9 @@
               <w:bottom w:val="single" w:color="auto" w:sz="4" w:space="0"/>
               <w:right w:val="single" w:color="auto" w:sz="4" w:space="0"/>
             </w:tcBorders>
-          </w:tcPr>
-          <w:p wp14:textId="77777777">
+            <w:tcMar/>
+          </w:tcPr>
+          <w:p wp14:textId="481D41DB">
             <w:pPr>
               <w:tabs>
                 <w:tab w:val="left" w:leader="dot" w:pos="10206"/>
@@ -998,6 +1223,12 @@
                 <w:lang w:val="vi-VN" w:eastAsia="en-US"/>
               </w:rPr>
             </w:pPr>
+            <w:r>
+              <w:rPr>
+                <w:lang w:val="vi-VN" w:eastAsia="en-US"/>
+              </w:rPr>
+              <w:t>{h2}</w:t>
+            </w:r>
           </w:p>
         </w:tc>
         <w:tc>
@@ -1009,8 +1240,9 @@
               <w:bottom w:val="single" w:color="auto" w:sz="4" w:space="0"/>
               <w:right w:val="single" w:color="auto" w:sz="4" w:space="0"/>
             </w:tcBorders>
-          </w:tcPr>
-          <w:p wp14:textId="77777777">
+            <w:tcMar/>
+          </w:tcPr>
+          <w:p wp14:textId="32864603">
             <w:pPr>
               <w:tabs>
                 <w:tab w:val="left" w:leader="dot" w:pos="10206"/>
@@ -1021,6 +1253,12 @@
                 <w:lang w:val="vi-VN" w:eastAsia="en-US"/>
               </w:rPr>
             </w:pPr>
+            <w:r>
+              <w:rPr>
+                <w:lang w:val="vi-VN" w:eastAsia="en-US"/>
+              </w:rPr>
+              <w:t>{h3}</w:t>
+            </w:r>
           </w:p>
         </w:tc>
         <w:tc>
@@ -1032,8 +1270,9 @@
               <w:bottom w:val="single" w:color="auto" w:sz="4" w:space="0"/>
               <w:right w:val="single" w:color="auto" w:sz="4" w:space="0"/>
             </w:tcBorders>
-          </w:tcPr>
-          <w:p wp14:textId="77777777">
+            <w:tcMar/>
+          </w:tcPr>
+          <w:p wp14:textId="42CF54A0">
             <w:pPr>
               <w:tabs>
                 <w:tab w:val="left" w:leader="dot" w:pos="10206"/>
@@ -1044,6 +1283,12 @@
                 <w:lang w:val="vi-VN" w:eastAsia="en-US"/>
               </w:rPr>
             </w:pPr>
+            <w:r>
+              <w:rPr>
+                <w:lang w:val="vi-VN" w:eastAsia="en-US"/>
+              </w:rPr>
+              <w:t>{h4}</w:t>
+            </w:r>
           </w:p>
         </w:tc>
         <w:tc>
@@ -1055,8 +1300,9 @@
               <w:bottom w:val="single" w:color="auto" w:sz="4" w:space="0"/>
               <w:right w:val="single" w:color="auto" w:sz="4" w:space="0"/>
             </w:tcBorders>
-          </w:tcPr>
-          <w:p wp14:textId="77777777">
+            <w:tcMar/>
+          </w:tcPr>
+          <w:p wp14:textId="098CA319">
             <w:pPr>
               <w:tabs>
                 <w:tab w:val="left" w:leader="dot" w:pos="10206"/>
@@ -1067,6 +1313,12 @@
                 <w:lang w:val="vi-VN" w:eastAsia="en-US"/>
               </w:rPr>
             </w:pPr>
+            <w:r>
+              <w:rPr>
+                <w:lang w:val="vi-VN" w:eastAsia="en-US"/>
+              </w:rPr>
+              <w:t>{h5}</w:t>
+            </w:r>
           </w:p>
         </w:tc>
         <w:tc>
@@ -1078,8 +1330,9 @@
               <w:bottom w:val="single" w:color="auto" w:sz="4" w:space="0"/>
               <w:right w:val="single" w:color="auto" w:sz="4" w:space="0"/>
             </w:tcBorders>
-          </w:tcPr>
-          <w:p wp14:textId="77777777">
+            <w:tcMar/>
+          </w:tcPr>
+          <w:p wp14:textId="5D718196">
             <w:pPr>
               <w:tabs>
                 <w:tab w:val="left" w:leader="dot" w:pos="10206"/>
@@ -1090,6 +1343,12 @@
                 <w:lang w:val="vi-VN" w:eastAsia="en-US"/>
               </w:rPr>
             </w:pPr>
+            <w:r>
+              <w:rPr>
+                <w:lang w:val="vi-VN" w:eastAsia="en-US"/>
+              </w:rPr>
+              <w:t>{h6}</w:t>
+            </w:r>
           </w:p>
         </w:tc>
         <w:tc>
@@ -1101,8 +1360,9 @@
               <w:bottom w:val="single" w:color="auto" w:sz="4" w:space="0"/>
               <w:right w:val="single" w:color="auto" w:sz="4" w:space="0"/>
             </w:tcBorders>
-          </w:tcPr>
-          <w:p wp14:textId="77777777">
+            <w:tcMar/>
+          </w:tcPr>
+          <w:p wp14:textId="3E9FA98E">
             <w:pPr>
               <w:tabs>
                 <w:tab w:val="left" w:leader="dot" w:pos="10206"/>
@@ -1113,6 +1373,12 @@
                 <w:lang w:val="vi-VN" w:eastAsia="en-US"/>
               </w:rPr>
             </w:pPr>
+            <w:r>
+              <w:rPr>
+                <w:lang w:val="vi-VN" w:eastAsia="en-US"/>
+              </w:rPr>
+              <w:t>{h7}</w:t>
+            </w:r>
           </w:p>
         </w:tc>
         <w:tc>
@@ -1124,8 +1390,9 @@
               <w:bottom w:val="single" w:color="auto" w:sz="4" w:space="0"/>
               <w:right w:val="single" w:color="auto" w:sz="4" w:space="0"/>
             </w:tcBorders>
-          </w:tcPr>
-          <w:p wp14:textId="77777777">
+            <w:tcMar/>
+          </w:tcPr>
+          <w:p wp14:textId="3B5EB2FF">
             <w:pPr>
               <w:tabs>
                 <w:tab w:val="left" w:leader="dot" w:pos="10206"/>
@@ -1136,6 +1403,12 @@
                 <w:lang w:val="vi-VN" w:eastAsia="en-US"/>
               </w:rPr>
             </w:pPr>
+            <w:r>
+              <w:rPr>
+                <w:lang w:val="vi-VN" w:eastAsia="en-US"/>
+              </w:rPr>
+              <w:t>{h8}</w:t>
+            </w:r>
           </w:p>
         </w:tc>
         <w:tc>
@@ -1147,8 +1420,9 @@
               <w:bottom w:val="single" w:color="auto" w:sz="4" w:space="0"/>
               <w:right w:val="single" w:color="auto" w:sz="4" w:space="0"/>
             </w:tcBorders>
-          </w:tcPr>
-          <w:p wp14:textId="77777777">
+            <w:tcMar/>
+          </w:tcPr>
+          <w:p wp14:textId="2F48B572">
             <w:pPr>
               <w:tabs>
                 <w:tab w:val="left" w:leader="dot" w:pos="10206"/>
@@ -1159,6 +1433,12 @@
                 <w:lang w:val="vi-VN" w:eastAsia="en-US"/>
               </w:rPr>
             </w:pPr>
+            <w:r>
+              <w:rPr>
+                <w:lang w:val="vi-VN" w:eastAsia="en-US"/>
+              </w:rPr>
+              <w:t>{h9}</w:t>
+            </w:r>
           </w:p>
         </w:tc>
         <w:tc>
@@ -1170,8 +1450,9 @@
               <w:bottom w:val="single" w:color="auto" w:sz="4" w:space="0"/>
               <w:right w:val="single" w:color="auto" w:sz="4" w:space="0"/>
             </w:tcBorders>
-          </w:tcPr>
-          <w:p wp14:textId="77777777">
+            <w:tcMar/>
+          </w:tcPr>
+          <w:p wp14:textId="302D44A0">
             <w:pPr>
               <w:tabs>
                 <w:tab w:val="left" w:leader="dot" w:pos="10206"/>
@@ -1182,6 +1463,12 @@
                 <w:lang w:val="vi-VN" w:eastAsia="en-US"/>
               </w:rPr>
             </w:pPr>
+            <w:r>
+              <w:rPr>
+                <w:lang w:val="vi-VN" w:eastAsia="en-US"/>
+              </w:rPr>
+              <w:t>{h10}</w:t>
+            </w:r>
           </w:p>
         </w:tc>
         <w:tc>
@@ -1193,8 +1480,9 @@
               <w:bottom w:val="single" w:color="auto" w:sz="4" w:space="0"/>
               <w:right w:val="single" w:color="auto" w:sz="4" w:space="0"/>
             </w:tcBorders>
-          </w:tcPr>
-          <w:p wp14:textId="77777777">
+            <w:tcMar/>
+          </w:tcPr>
+          <w:p wp14:textId="181B98A5">
             <w:pPr>
               <w:tabs>
                 <w:tab w:val="left" w:leader="dot" w:pos="10206"/>
@@ -1205,6 +1493,12 @@
                 <w:lang w:val="vi-VN" w:eastAsia="en-US"/>
               </w:rPr>
             </w:pPr>
+            <w:r>
+              <w:rPr>
+                <w:lang w:val="vi-VN" w:eastAsia="en-US"/>
+              </w:rPr>
+              <w:t>{h11}</w:t>
+            </w:r>
           </w:p>
         </w:tc>
         <w:tc>
@@ -1216,8 +1510,9 @@
               <w:bottom w:val="single" w:color="auto" w:sz="4" w:space="0"/>
               <w:right w:val="single" w:color="auto" w:sz="4" w:space="0"/>
             </w:tcBorders>
-          </w:tcPr>
-          <w:p wp14:textId="77777777">
+            <w:tcMar/>
+          </w:tcPr>
+          <w:p wp14:textId="48FD18F4">
             <w:pPr>
               <w:tabs>
                 <w:tab w:val="left" w:leader="dot" w:pos="10206"/>
@@ -1228,6 +1523,12 @@
                 <w:lang w:val="vi-VN" w:eastAsia="en-US"/>
               </w:rPr>
             </w:pPr>
+            <w:r>
+              <w:rPr>
+                <w:lang w:val="vi-VN" w:eastAsia="en-US"/>
+              </w:rPr>
+              <w:t>{h12}</w:t>
+            </w:r>
           </w:p>
         </w:tc>
       </w:tr>
@@ -1627,7 +1928,7 @@
             </w:tcBorders>
             <w:tcMar/>
           </w:tcPr>
-          <w:p wp14:textId="77777777">
+          <w:p wp14:textId="58832A0C">
             <w:pPr>
               <w:suppressAutoHyphens w:val="0"/>
               <w:spacing w:before="60" w:after="60"/>
@@ -1635,6 +1936,12 @@
                 <w:lang w:val="pt-BR" w:eastAsia="en-US"/>
               </w:rPr>
             </w:pPr>
+            <w:r>
+              <w:rPr>
+                <w:lang w:val="pt-BR" w:eastAsia="en-US"/>
+              </w:rPr>
+              <w:t>{#coOccupants}{index}</w:t>
+            </w:r>
           </w:p>
         </w:tc>
         <w:tc>
@@ -1648,7 +1955,7 @@
             </w:tcBorders>
             <w:tcMar/>
           </w:tcPr>
-          <w:p wp14:textId="77777777">
+          <w:p wp14:textId="08E2CE96">
             <w:pPr>
               <w:suppressAutoHyphens w:val="0"/>
               <w:spacing w:before="60" w:after="60"/>
@@ -1656,6 +1963,12 @@
                 <w:lang w:val="pt-BR" w:eastAsia="en-US"/>
               </w:rPr>
             </w:pPr>
+            <w:r>
+              <w:rPr>
+                <w:lang w:val="pt-BR" w:eastAsia="en-US"/>
+              </w:rPr>
+              <w:t>{fullName}</w:t>
+            </w:r>
           </w:p>
         </w:tc>
         <w:tc>
@@ -1669,7 +1982,7 @@
             </w:tcBorders>
             <w:tcMar/>
           </w:tcPr>
-          <w:p wp14:textId="77777777">
+          <w:p wp14:textId="5A789113">
             <w:pPr>
               <w:suppressAutoHyphens w:val="0"/>
               <w:spacing w:before="60" w:after="60"/>
@@ -1677,6 +1990,12 @@
                 <w:lang w:val="pt-BR" w:eastAsia="en-US"/>
               </w:rPr>
             </w:pPr>
+            <w:r>
+              <w:rPr>
+                <w:lang w:val="pt-BR" w:eastAsia="en-US"/>
+              </w:rPr>
+              <w:t>{dob}</w:t>
+            </w:r>
           </w:p>
         </w:tc>
         <w:tc>
@@ -1690,7 +2009,7 @@
             </w:tcBorders>
             <w:tcMar/>
           </w:tcPr>
-          <w:p wp14:textId="77777777">
+          <w:p wp14:textId="2C7F8B23">
             <w:pPr>
               <w:suppressAutoHyphens w:val="0"/>
               <w:spacing w:before="60" w:after="60"/>
@@ -1698,6 +2017,24 @@
                 <w:lang w:val="pt-BR" w:eastAsia="en-US"/>
               </w:rPr>
             </w:pPr>
+            <w:r>
+              <w:rPr>
+                <w:lang w:val="pt-BR" w:eastAsia="en-US"/>
+              </w:rPr>
+              <w:t>{</w:t>
+            </w:r>
+            <w:r>
+              <w:rPr>
+                <w:lang w:val="pt-BR" w:eastAsia="en-US"/>
+              </w:rPr>
+              <w:t>gender</w:t>
+            </w:r>
+            <w:r>
+              <w:rPr>
+                <w:lang w:val="pt-BR" w:eastAsia="en-US"/>
+              </w:rPr>
+              <w:t>}</w:t>
+            </w:r>
           </w:p>
         </w:tc>
         <w:tc>
@@ -1711,7 +2048,7 @@
             </w:tcBorders>
             <w:tcMar/>
           </w:tcPr>
-          <w:p wp14:textId="77777777">
+          <w:p wp14:textId="24D2EFEB">
             <w:pPr>
               <w:suppressAutoHyphens w:val="0"/>
               <w:spacing w:before="60" w:after="60"/>
@@ -1719,6 +2056,12 @@
                 <w:lang w:val="pt-BR" w:eastAsia="en-US"/>
               </w:rPr>
             </w:pPr>
+            <w:r>
+              <w:rPr>
+                <w:lang w:val="pt-BR" w:eastAsia="en-US"/>
+              </w:rPr>
+              <w:t>{nationalId}</w:t>
+            </w:r>
           </w:p>
         </w:tc>
         <w:tc>
@@ -1732,7 +2075,7 @@
             </w:tcBorders>
             <w:tcMar/>
           </w:tcPr>
-          <w:p wp14:textId="77777777">
+          <w:p wp14:textId="74E8B291">
             <w:pPr>
               <w:suppressAutoHyphens w:val="0"/>
               <w:spacing w:before="60" w:after="60"/>
@@ -1740,1042 +2083,47 @@
                 <w:lang w:val="pt-BR" w:eastAsia="en-US"/>
               </w:rPr>
             </w:pPr>
-          </w:p>
-        </w:tc>
-      </w:tr>
-      <w:tr xmlns:wp14="http://schemas.microsoft.com/office/word/2010/wordml" wp14:textId="77777777">
-        <w:trPr/>
-        <w:tc>
-          <w:tcPr>
-            <w:tcW w:w="570" w:type="dxa"/>
-            <w:tcBorders>
-              <w:top w:val="dotted" w:color="auto" w:sz="4" w:space="0"/>
-              <w:left w:val="single" w:color="auto" w:sz="4" w:space="0"/>
-              <w:bottom w:val="dotted" w:color="auto" w:sz="4" w:space="0"/>
-              <w:right w:val="single" w:color="auto" w:sz="4" w:space="0"/>
-            </w:tcBorders>
-            <w:tcMar/>
-          </w:tcPr>
-          <w:p wp14:textId="77777777">
-            <w:pPr>
-              <w:suppressAutoHyphens w:val="0"/>
-              <w:spacing w:before="60" w:after="60"/>
-              <w:rPr>
-                <w:lang w:val="pt-BR" w:eastAsia="en-US"/>
-              </w:rPr>
-            </w:pPr>
-          </w:p>
-        </w:tc>
-        <w:tc>
-          <w:tcPr>
-            <w:tcW w:w="2454" w:type="dxa"/>
-            <w:tcBorders>
-              <w:top w:val="dotted" w:color="auto" w:sz="4" w:space="0"/>
-              <w:left w:val="single" w:color="auto" w:sz="4" w:space="0"/>
-              <w:bottom w:val="dotted" w:color="auto" w:sz="4" w:space="0"/>
-              <w:right w:val="single" w:color="auto" w:sz="4" w:space="0"/>
-            </w:tcBorders>
-            <w:tcMar/>
-          </w:tcPr>
-          <w:p wp14:textId="77777777">
-            <w:pPr>
-              <w:suppressAutoHyphens w:val="0"/>
-              <w:spacing w:before="60" w:after="60"/>
-              <w:rPr>
-                <w:lang w:val="pt-BR" w:eastAsia="en-US"/>
-              </w:rPr>
-            </w:pPr>
-          </w:p>
-        </w:tc>
-        <w:tc>
-          <w:tcPr>
-            <w:tcW w:w="1495" w:type="dxa"/>
-            <w:tcBorders>
-              <w:top w:val="dotted" w:color="auto" w:sz="4" w:space="0"/>
-              <w:left w:val="single" w:color="auto" w:sz="4" w:space="0"/>
-              <w:bottom w:val="dotted" w:color="auto" w:sz="4" w:space="0"/>
-              <w:right w:val="single" w:color="auto" w:sz="4" w:space="0"/>
-            </w:tcBorders>
-            <w:tcMar/>
-          </w:tcPr>
-          <w:p wp14:textId="77777777">
-            <w:pPr>
-              <w:suppressAutoHyphens w:val="0"/>
-              <w:spacing w:before="60" w:after="60"/>
-              <w:rPr>
-                <w:lang w:val="pt-BR" w:eastAsia="en-US"/>
-              </w:rPr>
-            </w:pPr>
-          </w:p>
-        </w:tc>
-        <w:tc>
-          <w:tcPr>
-            <w:tcW w:w="729" w:type="dxa"/>
-            <w:tcBorders>
-              <w:top w:val="dotted" w:color="auto" w:sz="4" w:space="0"/>
-              <w:left w:val="single" w:color="auto" w:sz="4" w:space="0"/>
-              <w:bottom w:val="dotted" w:color="auto" w:sz="4" w:space="0"/>
-              <w:right w:val="single" w:color="auto" w:sz="4" w:space="0"/>
-            </w:tcBorders>
-            <w:tcMar/>
-          </w:tcPr>
-          <w:p wp14:textId="77777777">
-            <w:pPr>
-              <w:suppressAutoHyphens w:val="0"/>
-              <w:spacing w:before="60" w:after="60"/>
-              <w:rPr>
-                <w:lang w:val="pt-BR" w:eastAsia="en-US"/>
-              </w:rPr>
-            </w:pPr>
-          </w:p>
-        </w:tc>
-        <w:tc>
-          <w:tcPr>
-            <w:tcW w:w="2084" w:type="dxa"/>
-            <w:tcBorders>
-              <w:top w:val="dotted" w:color="auto" w:sz="4" w:space="0"/>
-              <w:left w:val="single" w:color="auto" w:sz="4" w:space="0"/>
-              <w:bottom w:val="dotted" w:color="auto" w:sz="4" w:space="0"/>
-              <w:right w:val="single" w:color="auto" w:sz="4" w:space="0"/>
-            </w:tcBorders>
-            <w:tcMar/>
-          </w:tcPr>
-          <w:p wp14:textId="77777777">
-            <w:pPr>
-              <w:suppressAutoHyphens w:val="0"/>
-              <w:spacing w:before="60" w:after="60"/>
-              <w:rPr>
-                <w:lang w:val="pt-BR" w:eastAsia="en-US"/>
-              </w:rPr>
-            </w:pPr>
-          </w:p>
-        </w:tc>
-        <w:tc>
-          <w:tcPr>
-            <w:tcW w:w="1493" w:type="dxa"/>
-            <w:tcBorders>
-              <w:top w:val="dotted" w:color="auto" w:sz="4" w:space="0"/>
-              <w:left w:val="single" w:color="auto" w:sz="4" w:space="0"/>
-              <w:bottom w:val="dotted" w:color="auto" w:sz="4" w:space="0"/>
-              <w:right w:val="single" w:color="auto" w:sz="4" w:space="0"/>
-            </w:tcBorders>
-            <w:tcMar/>
-          </w:tcPr>
-          <w:p wp14:textId="77777777">
-            <w:pPr>
-              <w:suppressAutoHyphens w:val="0"/>
-              <w:spacing w:before="60" w:after="60"/>
-              <w:rPr>
-                <w:lang w:val="pt-BR" w:eastAsia="en-US"/>
-              </w:rPr>
-            </w:pPr>
-          </w:p>
-        </w:tc>
-      </w:tr>
-      <w:tr xmlns:wp14="http://schemas.microsoft.com/office/word/2010/wordml" wp14:textId="77777777">
-        <w:trPr/>
-        <w:tc>
-          <w:tcPr>
-            <w:tcW w:w="570" w:type="dxa"/>
-            <w:tcBorders>
-              <w:top w:val="dotted" w:color="auto" w:sz="4" w:space="0"/>
-              <w:left w:val="single" w:color="auto" w:sz="4" w:space="0"/>
-              <w:bottom w:val="dotted" w:color="auto" w:sz="4" w:space="0"/>
-              <w:right w:val="single" w:color="auto" w:sz="4" w:space="0"/>
-            </w:tcBorders>
-            <w:tcMar/>
-          </w:tcPr>
-          <w:p wp14:textId="77777777">
-            <w:pPr>
-              <w:suppressAutoHyphens w:val="0"/>
-              <w:spacing w:before="60" w:after="60"/>
-              <w:rPr>
-                <w:lang w:val="pt-BR" w:eastAsia="en-US"/>
-              </w:rPr>
-            </w:pPr>
-          </w:p>
-        </w:tc>
-        <w:tc>
-          <w:tcPr>
-            <w:tcW w:w="2454" w:type="dxa"/>
-            <w:tcBorders>
-              <w:top w:val="dotted" w:color="auto" w:sz="4" w:space="0"/>
-              <w:left w:val="single" w:color="auto" w:sz="4" w:space="0"/>
-              <w:bottom w:val="dotted" w:color="auto" w:sz="4" w:space="0"/>
-              <w:right w:val="single" w:color="auto" w:sz="4" w:space="0"/>
-            </w:tcBorders>
-            <w:tcMar/>
-          </w:tcPr>
-          <w:p wp14:textId="77777777">
-            <w:pPr>
-              <w:suppressAutoHyphens w:val="0"/>
-              <w:spacing w:before="60" w:after="60"/>
-              <w:rPr>
-                <w:lang w:val="pt-BR" w:eastAsia="en-US"/>
-              </w:rPr>
-            </w:pPr>
-          </w:p>
-        </w:tc>
-        <w:tc>
-          <w:tcPr>
-            <w:tcW w:w="1495" w:type="dxa"/>
-            <w:tcBorders>
-              <w:top w:val="dotted" w:color="auto" w:sz="4" w:space="0"/>
-              <w:left w:val="single" w:color="auto" w:sz="4" w:space="0"/>
-              <w:bottom w:val="dotted" w:color="auto" w:sz="4" w:space="0"/>
-              <w:right w:val="single" w:color="auto" w:sz="4" w:space="0"/>
-            </w:tcBorders>
-            <w:tcMar/>
-          </w:tcPr>
-          <w:p wp14:textId="77777777">
-            <w:pPr>
-              <w:suppressAutoHyphens w:val="0"/>
-              <w:spacing w:before="60" w:after="60"/>
-              <w:rPr>
-                <w:lang w:val="pt-BR" w:eastAsia="en-US"/>
-              </w:rPr>
-            </w:pPr>
-          </w:p>
-        </w:tc>
-        <w:tc>
-          <w:tcPr>
-            <w:tcW w:w="729" w:type="dxa"/>
-            <w:tcBorders>
-              <w:top w:val="dotted" w:color="auto" w:sz="4" w:space="0"/>
-              <w:left w:val="single" w:color="auto" w:sz="4" w:space="0"/>
-              <w:bottom w:val="dotted" w:color="auto" w:sz="4" w:space="0"/>
-              <w:right w:val="single" w:color="auto" w:sz="4" w:space="0"/>
-            </w:tcBorders>
-            <w:tcMar/>
-          </w:tcPr>
-          <w:p wp14:textId="77777777">
-            <w:pPr>
-              <w:suppressAutoHyphens w:val="0"/>
-              <w:spacing w:before="60" w:after="60"/>
-              <w:rPr>
-                <w:lang w:val="pt-BR" w:eastAsia="en-US"/>
-              </w:rPr>
-            </w:pPr>
-          </w:p>
-        </w:tc>
-        <w:tc>
-          <w:tcPr>
-            <w:tcW w:w="2084" w:type="dxa"/>
-            <w:tcBorders>
-              <w:top w:val="dotted" w:color="auto" w:sz="4" w:space="0"/>
-              <w:left w:val="single" w:color="auto" w:sz="4" w:space="0"/>
-              <w:bottom w:val="dotted" w:color="auto" w:sz="4" w:space="0"/>
-              <w:right w:val="single" w:color="auto" w:sz="4" w:space="0"/>
-            </w:tcBorders>
-            <w:tcMar/>
-          </w:tcPr>
-          <w:p wp14:textId="77777777">
-            <w:pPr>
-              <w:suppressAutoHyphens w:val="0"/>
-              <w:spacing w:before="60" w:after="60"/>
-              <w:rPr>
-                <w:lang w:val="pt-BR" w:eastAsia="en-US"/>
-              </w:rPr>
-            </w:pPr>
-          </w:p>
-        </w:tc>
-        <w:tc>
-          <w:tcPr>
-            <w:tcW w:w="1493" w:type="dxa"/>
-            <w:tcBorders>
-              <w:top w:val="dotted" w:color="auto" w:sz="4" w:space="0"/>
-              <w:left w:val="single" w:color="auto" w:sz="4" w:space="0"/>
-              <w:bottom w:val="dotted" w:color="auto" w:sz="4" w:space="0"/>
-              <w:right w:val="single" w:color="auto" w:sz="4" w:space="0"/>
-            </w:tcBorders>
-            <w:tcMar/>
-          </w:tcPr>
-          <w:p wp14:textId="77777777">
-            <w:pPr>
-              <w:suppressAutoHyphens w:val="0"/>
-              <w:spacing w:before="60" w:after="60"/>
-              <w:rPr>
-                <w:lang w:val="pt-BR" w:eastAsia="en-US"/>
-              </w:rPr>
-            </w:pPr>
-          </w:p>
-        </w:tc>
-      </w:tr>
-      <w:tr xmlns:wp14="http://schemas.microsoft.com/office/word/2010/wordml" wp14:textId="77777777">
-        <w:trPr/>
-        <w:tc>
-          <w:tcPr>
-            <w:tcW w:w="570" w:type="dxa"/>
-            <w:tcBorders>
-              <w:top w:val="dotted" w:color="auto" w:sz="4" w:space="0"/>
-              <w:left w:val="single" w:color="auto" w:sz="4" w:space="0"/>
-              <w:bottom w:val="dotted" w:color="auto" w:sz="4" w:space="0"/>
-              <w:right w:val="single" w:color="auto" w:sz="4" w:space="0"/>
-            </w:tcBorders>
-            <w:tcMar/>
-          </w:tcPr>
-          <w:p wp14:textId="77777777">
-            <w:pPr>
-              <w:suppressAutoHyphens w:val="0"/>
-              <w:spacing w:before="60" w:after="60"/>
-              <w:rPr>
-                <w:lang w:val="pt-BR" w:eastAsia="en-US"/>
-              </w:rPr>
-            </w:pPr>
-          </w:p>
-        </w:tc>
-        <w:tc>
-          <w:tcPr>
-            <w:tcW w:w="2454" w:type="dxa"/>
-            <w:tcBorders>
-              <w:top w:val="dotted" w:color="auto" w:sz="4" w:space="0"/>
-              <w:left w:val="single" w:color="auto" w:sz="4" w:space="0"/>
-              <w:bottom w:val="dotted" w:color="auto" w:sz="4" w:space="0"/>
-              <w:right w:val="single" w:color="auto" w:sz="4" w:space="0"/>
-            </w:tcBorders>
-            <w:tcMar/>
-          </w:tcPr>
-          <w:p wp14:textId="77777777">
-            <w:pPr>
-              <w:suppressAutoHyphens w:val="0"/>
-              <w:spacing w:before="60" w:after="60"/>
-              <w:rPr>
-                <w:lang w:val="pt-BR" w:eastAsia="en-US"/>
-              </w:rPr>
-            </w:pPr>
-          </w:p>
-        </w:tc>
-        <w:tc>
-          <w:tcPr>
-            <w:tcW w:w="1495" w:type="dxa"/>
-            <w:tcBorders>
-              <w:top w:val="dotted" w:color="auto" w:sz="4" w:space="0"/>
-              <w:left w:val="single" w:color="auto" w:sz="4" w:space="0"/>
-              <w:bottom w:val="dotted" w:color="auto" w:sz="4" w:space="0"/>
-              <w:right w:val="single" w:color="auto" w:sz="4" w:space="0"/>
-            </w:tcBorders>
-            <w:tcMar/>
-          </w:tcPr>
-          <w:p wp14:textId="77777777">
-            <w:pPr>
-              <w:suppressAutoHyphens w:val="0"/>
-              <w:spacing w:before="60" w:after="60"/>
-              <w:rPr>
-                <w:lang w:val="pt-BR" w:eastAsia="en-US"/>
-              </w:rPr>
-            </w:pPr>
-          </w:p>
-        </w:tc>
-        <w:tc>
-          <w:tcPr>
-            <w:tcW w:w="729" w:type="dxa"/>
-            <w:tcBorders>
-              <w:top w:val="dotted" w:color="auto" w:sz="4" w:space="0"/>
-              <w:left w:val="single" w:color="auto" w:sz="4" w:space="0"/>
-              <w:bottom w:val="dotted" w:color="auto" w:sz="4" w:space="0"/>
-              <w:right w:val="single" w:color="auto" w:sz="4" w:space="0"/>
-            </w:tcBorders>
-            <w:tcMar/>
-          </w:tcPr>
-          <w:p wp14:textId="77777777">
-            <w:pPr>
-              <w:suppressAutoHyphens w:val="0"/>
-              <w:spacing w:before="60" w:after="60"/>
-              <w:rPr>
-                <w:lang w:val="pt-BR" w:eastAsia="en-US"/>
-              </w:rPr>
-            </w:pPr>
-          </w:p>
-        </w:tc>
-        <w:tc>
-          <w:tcPr>
-            <w:tcW w:w="2084" w:type="dxa"/>
-            <w:tcBorders>
-              <w:top w:val="dotted" w:color="auto" w:sz="4" w:space="0"/>
-              <w:left w:val="single" w:color="auto" w:sz="4" w:space="0"/>
-              <w:bottom w:val="dotted" w:color="auto" w:sz="4" w:space="0"/>
-              <w:right w:val="single" w:color="auto" w:sz="4" w:space="0"/>
-            </w:tcBorders>
-            <w:tcMar/>
-          </w:tcPr>
-          <w:p wp14:textId="77777777">
-            <w:pPr>
-              <w:suppressAutoHyphens w:val="0"/>
-              <w:spacing w:before="60" w:after="60"/>
-              <w:rPr>
-                <w:lang w:val="pt-BR" w:eastAsia="en-US"/>
-              </w:rPr>
-            </w:pPr>
-          </w:p>
-        </w:tc>
-        <w:tc>
-          <w:tcPr>
-            <w:tcW w:w="1493" w:type="dxa"/>
-            <w:tcBorders>
-              <w:top w:val="dotted" w:color="auto" w:sz="4" w:space="0"/>
-              <w:left w:val="single" w:color="auto" w:sz="4" w:space="0"/>
-              <w:bottom w:val="dotted" w:color="auto" w:sz="4" w:space="0"/>
-              <w:right w:val="single" w:color="auto" w:sz="4" w:space="0"/>
-            </w:tcBorders>
-            <w:tcMar/>
-          </w:tcPr>
-          <w:p wp14:textId="77777777">
-            <w:pPr>
-              <w:suppressAutoHyphens w:val="0"/>
-              <w:spacing w:before="60" w:after="60"/>
-              <w:rPr>
-                <w:lang w:val="pt-BR" w:eastAsia="en-US"/>
-              </w:rPr>
-            </w:pPr>
-          </w:p>
-        </w:tc>
-      </w:tr>
-      <w:tr xmlns:wp14="http://schemas.microsoft.com/office/word/2010/wordml" wp14:textId="77777777">
-        <w:trPr/>
-        <w:tc>
-          <w:tcPr>
-            <w:tcW w:w="570" w:type="dxa"/>
-            <w:tcBorders>
-              <w:top w:val="dotted" w:color="auto" w:sz="4" w:space="0"/>
-              <w:left w:val="single" w:color="auto" w:sz="4" w:space="0"/>
-              <w:bottom w:val="dotted" w:color="auto" w:sz="4" w:space="0"/>
-              <w:right w:val="single" w:color="auto" w:sz="4" w:space="0"/>
-            </w:tcBorders>
-            <w:tcMar/>
-          </w:tcPr>
-          <w:p wp14:textId="77777777">
-            <w:pPr>
-              <w:suppressAutoHyphens w:val="0"/>
-              <w:spacing w:before="60" w:after="60"/>
-              <w:rPr>
-                <w:lang w:val="pt-BR" w:eastAsia="en-US"/>
-              </w:rPr>
-            </w:pPr>
-          </w:p>
-        </w:tc>
-        <w:tc>
-          <w:tcPr>
-            <w:tcW w:w="2454" w:type="dxa"/>
-            <w:tcBorders>
-              <w:top w:val="dotted" w:color="auto" w:sz="4" w:space="0"/>
-              <w:left w:val="single" w:color="auto" w:sz="4" w:space="0"/>
-              <w:bottom w:val="dotted" w:color="auto" w:sz="4" w:space="0"/>
-              <w:right w:val="single" w:color="auto" w:sz="4" w:space="0"/>
-            </w:tcBorders>
-            <w:tcMar/>
-          </w:tcPr>
-          <w:p wp14:textId="77777777">
-            <w:pPr>
-              <w:suppressAutoHyphens w:val="0"/>
-              <w:spacing w:before="60" w:after="60"/>
-              <w:rPr>
-                <w:lang w:val="pt-BR" w:eastAsia="en-US"/>
-              </w:rPr>
-            </w:pPr>
-          </w:p>
-        </w:tc>
-        <w:tc>
-          <w:tcPr>
-            <w:tcW w:w="1495" w:type="dxa"/>
-            <w:tcBorders>
-              <w:top w:val="dotted" w:color="auto" w:sz="4" w:space="0"/>
-              <w:left w:val="single" w:color="auto" w:sz="4" w:space="0"/>
-              <w:bottom w:val="dotted" w:color="auto" w:sz="4" w:space="0"/>
-              <w:right w:val="single" w:color="auto" w:sz="4" w:space="0"/>
-            </w:tcBorders>
-            <w:tcMar/>
-          </w:tcPr>
-          <w:p wp14:textId="77777777">
-            <w:pPr>
-              <w:suppressAutoHyphens w:val="0"/>
-              <w:spacing w:before="60" w:after="60"/>
-              <w:rPr>
-                <w:lang w:val="pt-BR" w:eastAsia="en-US"/>
-              </w:rPr>
-            </w:pPr>
-          </w:p>
-        </w:tc>
-        <w:tc>
-          <w:tcPr>
-            <w:tcW w:w="729" w:type="dxa"/>
-            <w:tcBorders>
-              <w:top w:val="dotted" w:color="auto" w:sz="4" w:space="0"/>
-              <w:left w:val="single" w:color="auto" w:sz="4" w:space="0"/>
-              <w:bottom w:val="dotted" w:color="auto" w:sz="4" w:space="0"/>
-              <w:right w:val="single" w:color="auto" w:sz="4" w:space="0"/>
-            </w:tcBorders>
-            <w:tcMar/>
-          </w:tcPr>
-          <w:p wp14:textId="77777777">
-            <w:pPr>
-              <w:suppressAutoHyphens w:val="0"/>
-              <w:spacing w:before="60" w:after="60"/>
-              <w:rPr>
-                <w:lang w:val="pt-BR" w:eastAsia="en-US"/>
-              </w:rPr>
-            </w:pPr>
-          </w:p>
-        </w:tc>
-        <w:tc>
-          <w:tcPr>
-            <w:tcW w:w="2084" w:type="dxa"/>
-            <w:tcBorders>
-              <w:top w:val="dotted" w:color="auto" w:sz="4" w:space="0"/>
-              <w:left w:val="single" w:color="auto" w:sz="4" w:space="0"/>
-              <w:bottom w:val="dotted" w:color="auto" w:sz="4" w:space="0"/>
-              <w:right w:val="single" w:color="auto" w:sz="4" w:space="0"/>
-            </w:tcBorders>
-            <w:tcMar/>
-          </w:tcPr>
-          <w:p wp14:textId="77777777">
-            <w:pPr>
-              <w:suppressAutoHyphens w:val="0"/>
-              <w:spacing w:before="60" w:after="60"/>
-              <w:rPr>
-                <w:lang w:val="pt-BR" w:eastAsia="en-US"/>
-              </w:rPr>
-            </w:pPr>
-          </w:p>
-        </w:tc>
-        <w:tc>
-          <w:tcPr>
-            <w:tcW w:w="1493" w:type="dxa"/>
-            <w:tcBorders>
-              <w:top w:val="dotted" w:color="auto" w:sz="4" w:space="0"/>
-              <w:left w:val="single" w:color="auto" w:sz="4" w:space="0"/>
-              <w:bottom w:val="dotted" w:color="auto" w:sz="4" w:space="0"/>
-              <w:right w:val="single" w:color="auto" w:sz="4" w:space="0"/>
-            </w:tcBorders>
-            <w:tcMar/>
-          </w:tcPr>
-          <w:p wp14:textId="77777777">
-            <w:pPr>
-              <w:suppressAutoHyphens w:val="0"/>
-              <w:spacing w:before="60" w:after="60"/>
-              <w:rPr>
-                <w:lang w:val="pt-BR" w:eastAsia="en-US"/>
-              </w:rPr>
-            </w:pPr>
-          </w:p>
-        </w:tc>
-      </w:tr>
-      <w:tr xmlns:wp14="http://schemas.microsoft.com/office/word/2010/wordml" wp14:textId="77777777">
-        <w:trPr/>
-        <w:tc>
-          <w:tcPr>
-            <w:tcW w:w="570" w:type="dxa"/>
-            <w:tcBorders>
-              <w:top w:val="dotted" w:color="auto" w:sz="4" w:space="0"/>
-              <w:left w:val="single" w:color="auto" w:sz="4" w:space="0"/>
-              <w:bottom w:val="dotted" w:color="auto" w:sz="4" w:space="0"/>
-              <w:right w:val="single" w:color="auto" w:sz="4" w:space="0"/>
-            </w:tcBorders>
-            <w:tcMar/>
-          </w:tcPr>
-          <w:p wp14:textId="77777777">
-            <w:pPr>
-              <w:suppressAutoHyphens w:val="0"/>
-              <w:spacing w:before="60" w:after="60"/>
-              <w:rPr>
-                <w:lang w:val="pt-BR" w:eastAsia="en-US"/>
-              </w:rPr>
-            </w:pPr>
-          </w:p>
-        </w:tc>
-        <w:tc>
-          <w:tcPr>
-            <w:tcW w:w="2454" w:type="dxa"/>
-            <w:tcBorders>
-              <w:top w:val="dotted" w:color="auto" w:sz="4" w:space="0"/>
-              <w:left w:val="single" w:color="auto" w:sz="4" w:space="0"/>
-              <w:bottom w:val="dotted" w:color="auto" w:sz="4" w:space="0"/>
-              <w:right w:val="single" w:color="auto" w:sz="4" w:space="0"/>
-            </w:tcBorders>
-            <w:tcMar/>
-          </w:tcPr>
-          <w:p wp14:textId="77777777">
-            <w:pPr>
-              <w:suppressAutoHyphens w:val="0"/>
-              <w:spacing w:before="60" w:after="60"/>
-              <w:rPr>
-                <w:lang w:val="pt-BR" w:eastAsia="en-US"/>
-              </w:rPr>
-            </w:pPr>
-          </w:p>
-        </w:tc>
-        <w:tc>
-          <w:tcPr>
-            <w:tcW w:w="1495" w:type="dxa"/>
-            <w:tcBorders>
-              <w:top w:val="dotted" w:color="auto" w:sz="4" w:space="0"/>
-              <w:left w:val="single" w:color="auto" w:sz="4" w:space="0"/>
-              <w:bottom w:val="dotted" w:color="auto" w:sz="4" w:space="0"/>
-              <w:right w:val="single" w:color="auto" w:sz="4" w:space="0"/>
-            </w:tcBorders>
-            <w:tcMar/>
-          </w:tcPr>
-          <w:p wp14:textId="77777777">
-            <w:pPr>
-              <w:suppressAutoHyphens w:val="0"/>
-              <w:spacing w:before="60" w:after="60"/>
-              <w:rPr>
-                <w:lang w:val="pt-BR" w:eastAsia="en-US"/>
-              </w:rPr>
-            </w:pPr>
-          </w:p>
-        </w:tc>
-        <w:tc>
-          <w:tcPr>
-            <w:tcW w:w="729" w:type="dxa"/>
-            <w:tcBorders>
-              <w:top w:val="dotted" w:color="auto" w:sz="4" w:space="0"/>
-              <w:left w:val="single" w:color="auto" w:sz="4" w:space="0"/>
-              <w:bottom w:val="dotted" w:color="auto" w:sz="4" w:space="0"/>
-              <w:right w:val="single" w:color="auto" w:sz="4" w:space="0"/>
-            </w:tcBorders>
-            <w:tcMar/>
-          </w:tcPr>
-          <w:p wp14:textId="77777777">
-            <w:pPr>
-              <w:suppressAutoHyphens w:val="0"/>
-              <w:spacing w:before="60" w:after="60"/>
-              <w:rPr>
-                <w:lang w:val="pt-BR" w:eastAsia="en-US"/>
-              </w:rPr>
-            </w:pPr>
-          </w:p>
-        </w:tc>
-        <w:tc>
-          <w:tcPr>
-            <w:tcW w:w="2084" w:type="dxa"/>
-            <w:tcBorders>
-              <w:top w:val="dotted" w:color="auto" w:sz="4" w:space="0"/>
-              <w:left w:val="single" w:color="auto" w:sz="4" w:space="0"/>
-              <w:bottom w:val="dotted" w:color="auto" w:sz="4" w:space="0"/>
-              <w:right w:val="single" w:color="auto" w:sz="4" w:space="0"/>
-            </w:tcBorders>
-            <w:tcMar/>
-          </w:tcPr>
-          <w:p wp14:textId="77777777">
-            <w:pPr>
-              <w:suppressAutoHyphens w:val="0"/>
-              <w:spacing w:before="60" w:after="60"/>
-              <w:rPr>
-                <w:lang w:val="pt-BR" w:eastAsia="en-US"/>
-              </w:rPr>
-            </w:pPr>
-          </w:p>
-        </w:tc>
-        <w:tc>
-          <w:tcPr>
-            <w:tcW w:w="1493" w:type="dxa"/>
-            <w:tcBorders>
-              <w:top w:val="dotted" w:color="auto" w:sz="4" w:space="0"/>
-              <w:left w:val="single" w:color="auto" w:sz="4" w:space="0"/>
-              <w:bottom w:val="dotted" w:color="auto" w:sz="4" w:space="0"/>
-              <w:right w:val="single" w:color="auto" w:sz="4" w:space="0"/>
-            </w:tcBorders>
-            <w:tcMar/>
-          </w:tcPr>
-          <w:p wp14:textId="77777777">
-            <w:pPr>
-              <w:suppressAutoHyphens w:val="0"/>
-              <w:spacing w:before="60" w:after="60"/>
-              <w:rPr>
-                <w:lang w:val="pt-BR" w:eastAsia="en-US"/>
-              </w:rPr>
-            </w:pPr>
-          </w:p>
-        </w:tc>
-      </w:tr>
-      <w:tr xmlns:wp14="http://schemas.microsoft.com/office/word/2010/wordml" wp14:textId="77777777">
-        <w:trPr/>
-        <w:tc>
-          <w:tcPr>
-            <w:tcW w:w="570" w:type="dxa"/>
-            <w:tcBorders>
-              <w:top w:val="dotted" w:color="auto" w:sz="4" w:space="0"/>
-              <w:left w:val="single" w:color="auto" w:sz="4" w:space="0"/>
-              <w:bottom w:val="dotted" w:color="auto" w:sz="4" w:space="0"/>
-              <w:right w:val="single" w:color="auto" w:sz="4" w:space="0"/>
-            </w:tcBorders>
-            <w:tcMar/>
-          </w:tcPr>
-          <w:p wp14:textId="77777777">
-            <w:pPr>
-              <w:suppressAutoHyphens w:val="0"/>
-              <w:spacing w:before="60" w:after="60"/>
-              <w:rPr>
-                <w:lang w:val="pt-BR" w:eastAsia="en-US"/>
-              </w:rPr>
-            </w:pPr>
-          </w:p>
-        </w:tc>
-        <w:tc>
-          <w:tcPr>
-            <w:tcW w:w="2454" w:type="dxa"/>
-            <w:tcBorders>
-              <w:top w:val="dotted" w:color="auto" w:sz="4" w:space="0"/>
-              <w:left w:val="single" w:color="auto" w:sz="4" w:space="0"/>
-              <w:bottom w:val="dotted" w:color="auto" w:sz="4" w:space="0"/>
-              <w:right w:val="single" w:color="auto" w:sz="4" w:space="0"/>
-            </w:tcBorders>
-            <w:tcMar/>
-          </w:tcPr>
-          <w:p wp14:textId="77777777">
-            <w:pPr>
-              <w:suppressAutoHyphens w:val="0"/>
-              <w:spacing w:before="60" w:after="60"/>
-              <w:rPr>
-                <w:lang w:val="pt-BR" w:eastAsia="en-US"/>
-              </w:rPr>
-            </w:pPr>
-          </w:p>
-        </w:tc>
-        <w:tc>
-          <w:tcPr>
-            <w:tcW w:w="1495" w:type="dxa"/>
-            <w:tcBorders>
-              <w:top w:val="dotted" w:color="auto" w:sz="4" w:space="0"/>
-              <w:left w:val="single" w:color="auto" w:sz="4" w:space="0"/>
-              <w:bottom w:val="dotted" w:color="auto" w:sz="4" w:space="0"/>
-              <w:right w:val="single" w:color="auto" w:sz="4" w:space="0"/>
-            </w:tcBorders>
-            <w:tcMar/>
-          </w:tcPr>
-          <w:p wp14:textId="77777777">
-            <w:pPr>
-              <w:suppressAutoHyphens w:val="0"/>
-              <w:spacing w:before="60" w:after="60"/>
-              <w:rPr>
-                <w:lang w:val="pt-BR" w:eastAsia="en-US"/>
-              </w:rPr>
-            </w:pPr>
-          </w:p>
-        </w:tc>
-        <w:tc>
-          <w:tcPr>
-            <w:tcW w:w="729" w:type="dxa"/>
-            <w:tcBorders>
-              <w:top w:val="dotted" w:color="auto" w:sz="4" w:space="0"/>
-              <w:left w:val="single" w:color="auto" w:sz="4" w:space="0"/>
-              <w:bottom w:val="dotted" w:color="auto" w:sz="4" w:space="0"/>
-              <w:right w:val="single" w:color="auto" w:sz="4" w:space="0"/>
-            </w:tcBorders>
-            <w:tcMar/>
-          </w:tcPr>
-          <w:p wp14:textId="77777777">
-            <w:pPr>
-              <w:suppressAutoHyphens w:val="0"/>
-              <w:spacing w:before="60" w:after="60"/>
-              <w:rPr>
-                <w:lang w:val="pt-BR" w:eastAsia="en-US"/>
-              </w:rPr>
-            </w:pPr>
-          </w:p>
-        </w:tc>
-        <w:tc>
-          <w:tcPr>
-            <w:tcW w:w="2084" w:type="dxa"/>
-            <w:tcBorders>
-              <w:top w:val="dotted" w:color="auto" w:sz="4" w:space="0"/>
-              <w:left w:val="single" w:color="auto" w:sz="4" w:space="0"/>
-              <w:bottom w:val="dotted" w:color="auto" w:sz="4" w:space="0"/>
-              <w:right w:val="single" w:color="auto" w:sz="4" w:space="0"/>
-            </w:tcBorders>
-            <w:tcMar/>
-          </w:tcPr>
-          <w:p wp14:textId="77777777">
-            <w:pPr>
-              <w:suppressAutoHyphens w:val="0"/>
-              <w:spacing w:before="60" w:after="60"/>
-              <w:rPr>
-                <w:lang w:val="pt-BR" w:eastAsia="en-US"/>
-              </w:rPr>
-            </w:pPr>
-          </w:p>
-        </w:tc>
-        <w:tc>
-          <w:tcPr>
-            <w:tcW w:w="1493" w:type="dxa"/>
-            <w:tcBorders>
-              <w:top w:val="dotted" w:color="auto" w:sz="4" w:space="0"/>
-              <w:left w:val="single" w:color="auto" w:sz="4" w:space="0"/>
-              <w:bottom w:val="dotted" w:color="auto" w:sz="4" w:space="0"/>
-              <w:right w:val="single" w:color="auto" w:sz="4" w:space="0"/>
-            </w:tcBorders>
-            <w:tcMar/>
-          </w:tcPr>
-          <w:p wp14:textId="77777777">
-            <w:pPr>
-              <w:suppressAutoHyphens w:val="0"/>
-              <w:spacing w:before="60" w:after="60"/>
-              <w:rPr>
-                <w:lang w:val="pt-BR" w:eastAsia="en-US"/>
-              </w:rPr>
-            </w:pPr>
-          </w:p>
-        </w:tc>
-      </w:tr>
-      <w:tr xmlns:wp14="http://schemas.microsoft.com/office/word/2010/wordml" wp14:textId="77777777">
-        <w:trPr/>
-        <w:tc>
-          <w:tcPr>
-            <w:tcW w:w="570" w:type="dxa"/>
-            <w:tcBorders>
-              <w:top w:val="dotted" w:color="auto" w:sz="4" w:space="0"/>
-              <w:left w:val="single" w:color="auto" w:sz="4" w:space="0"/>
-              <w:bottom w:val="dotted" w:color="auto" w:sz="4" w:space="0"/>
-              <w:right w:val="single" w:color="auto" w:sz="4" w:space="0"/>
-            </w:tcBorders>
-            <w:tcMar/>
-          </w:tcPr>
-          <w:p wp14:textId="77777777">
-            <w:pPr>
-              <w:suppressAutoHyphens w:val="0"/>
-              <w:spacing w:before="60" w:after="60"/>
-              <w:rPr>
-                <w:lang w:val="pt-BR" w:eastAsia="en-US"/>
-              </w:rPr>
-            </w:pPr>
-          </w:p>
-        </w:tc>
-        <w:tc>
-          <w:tcPr>
-            <w:tcW w:w="2454" w:type="dxa"/>
-            <w:tcBorders>
-              <w:top w:val="dotted" w:color="auto" w:sz="4" w:space="0"/>
-              <w:left w:val="single" w:color="auto" w:sz="4" w:space="0"/>
-              <w:bottom w:val="dotted" w:color="auto" w:sz="4" w:space="0"/>
-              <w:right w:val="single" w:color="auto" w:sz="4" w:space="0"/>
-            </w:tcBorders>
-            <w:tcMar/>
-          </w:tcPr>
-          <w:p wp14:textId="77777777">
-            <w:pPr>
-              <w:suppressAutoHyphens w:val="0"/>
-              <w:spacing w:before="60" w:after="60"/>
-              <w:rPr>
-                <w:lang w:val="pt-BR" w:eastAsia="en-US"/>
-              </w:rPr>
-            </w:pPr>
-          </w:p>
-        </w:tc>
-        <w:tc>
-          <w:tcPr>
-            <w:tcW w:w="1495" w:type="dxa"/>
-            <w:tcBorders>
-              <w:top w:val="dotted" w:color="auto" w:sz="4" w:space="0"/>
-              <w:left w:val="single" w:color="auto" w:sz="4" w:space="0"/>
-              <w:bottom w:val="dotted" w:color="auto" w:sz="4" w:space="0"/>
-              <w:right w:val="single" w:color="auto" w:sz="4" w:space="0"/>
-            </w:tcBorders>
-            <w:tcMar/>
-          </w:tcPr>
-          <w:p wp14:textId="77777777">
-            <w:pPr>
-              <w:suppressAutoHyphens w:val="0"/>
-              <w:spacing w:before="60" w:after="60"/>
-              <w:rPr>
-                <w:lang w:val="pt-BR" w:eastAsia="en-US"/>
-              </w:rPr>
-            </w:pPr>
-          </w:p>
-        </w:tc>
-        <w:tc>
-          <w:tcPr>
-            <w:tcW w:w="729" w:type="dxa"/>
-            <w:tcBorders>
-              <w:top w:val="dotted" w:color="auto" w:sz="4" w:space="0"/>
-              <w:left w:val="single" w:color="auto" w:sz="4" w:space="0"/>
-              <w:bottom w:val="dotted" w:color="auto" w:sz="4" w:space="0"/>
-              <w:right w:val="single" w:color="auto" w:sz="4" w:space="0"/>
-            </w:tcBorders>
-            <w:tcMar/>
-          </w:tcPr>
-          <w:p wp14:textId="77777777">
-            <w:pPr>
-              <w:suppressAutoHyphens w:val="0"/>
-              <w:spacing w:before="60" w:after="60"/>
-              <w:rPr>
-                <w:lang w:val="pt-BR" w:eastAsia="en-US"/>
-              </w:rPr>
-            </w:pPr>
-          </w:p>
-        </w:tc>
-        <w:tc>
-          <w:tcPr>
-            <w:tcW w:w="2084" w:type="dxa"/>
-            <w:tcBorders>
-              <w:top w:val="dotted" w:color="auto" w:sz="4" w:space="0"/>
-              <w:left w:val="single" w:color="auto" w:sz="4" w:space="0"/>
-              <w:bottom w:val="dotted" w:color="auto" w:sz="4" w:space="0"/>
-              <w:right w:val="single" w:color="auto" w:sz="4" w:space="0"/>
-            </w:tcBorders>
-            <w:tcMar/>
-          </w:tcPr>
-          <w:p wp14:textId="77777777">
-            <w:pPr>
-              <w:suppressAutoHyphens w:val="0"/>
-              <w:spacing w:before="60" w:after="60"/>
-              <w:rPr>
-                <w:lang w:val="pt-BR" w:eastAsia="en-US"/>
-              </w:rPr>
-            </w:pPr>
-          </w:p>
-        </w:tc>
-        <w:tc>
-          <w:tcPr>
-            <w:tcW w:w="1493" w:type="dxa"/>
-            <w:tcBorders>
-              <w:top w:val="dotted" w:color="auto" w:sz="4" w:space="0"/>
-              <w:left w:val="single" w:color="auto" w:sz="4" w:space="0"/>
-              <w:bottom w:val="dotted" w:color="auto" w:sz="4" w:space="0"/>
-              <w:right w:val="single" w:color="auto" w:sz="4" w:space="0"/>
-            </w:tcBorders>
-            <w:tcMar/>
-          </w:tcPr>
-          <w:p wp14:textId="77777777">
-            <w:pPr>
-              <w:suppressAutoHyphens w:val="0"/>
-              <w:spacing w:before="60" w:after="60"/>
-              <w:rPr>
-                <w:lang w:val="pt-BR" w:eastAsia="en-US"/>
-              </w:rPr>
-            </w:pPr>
-          </w:p>
-        </w:tc>
-      </w:tr>
-      <w:tr xmlns:wp14="http://schemas.microsoft.com/office/word/2010/wordml" wp14:textId="77777777">
-        <w:trPr/>
-        <w:tc>
-          <w:tcPr>
-            <w:tcW w:w="570" w:type="dxa"/>
-            <w:tcBorders>
-              <w:top w:val="dotted" w:color="auto" w:sz="4" w:space="0"/>
-              <w:left w:val="single" w:color="auto" w:sz="4" w:space="0"/>
-              <w:bottom w:val="dotted" w:color="auto" w:sz="4" w:space="0"/>
-              <w:right w:val="single" w:color="auto" w:sz="4" w:space="0"/>
-            </w:tcBorders>
-            <w:tcMar/>
-          </w:tcPr>
-          <w:p wp14:textId="77777777">
-            <w:pPr>
-              <w:suppressAutoHyphens w:val="0"/>
-              <w:spacing w:before="60" w:after="60"/>
-              <w:rPr>
-                <w:lang w:val="pt-BR" w:eastAsia="en-US"/>
-              </w:rPr>
-            </w:pPr>
-          </w:p>
-        </w:tc>
-        <w:tc>
-          <w:tcPr>
-            <w:tcW w:w="2454" w:type="dxa"/>
-            <w:tcBorders>
-              <w:top w:val="dotted" w:color="auto" w:sz="4" w:space="0"/>
-              <w:left w:val="single" w:color="auto" w:sz="4" w:space="0"/>
-              <w:bottom w:val="dotted" w:color="auto" w:sz="4" w:space="0"/>
-              <w:right w:val="single" w:color="auto" w:sz="4" w:space="0"/>
-            </w:tcBorders>
-            <w:tcMar/>
-          </w:tcPr>
-          <w:p wp14:textId="77777777">
-            <w:pPr>
-              <w:suppressAutoHyphens w:val="0"/>
-              <w:spacing w:before="60" w:after="60"/>
-              <w:rPr>
-                <w:lang w:val="pt-BR" w:eastAsia="en-US"/>
-              </w:rPr>
-            </w:pPr>
-          </w:p>
-        </w:tc>
-        <w:tc>
-          <w:tcPr>
-            <w:tcW w:w="1495" w:type="dxa"/>
-            <w:tcBorders>
-              <w:top w:val="dotted" w:color="auto" w:sz="4" w:space="0"/>
-              <w:left w:val="single" w:color="auto" w:sz="4" w:space="0"/>
-              <w:bottom w:val="dotted" w:color="auto" w:sz="4" w:space="0"/>
-              <w:right w:val="single" w:color="auto" w:sz="4" w:space="0"/>
-            </w:tcBorders>
-            <w:tcMar/>
-          </w:tcPr>
-          <w:p wp14:textId="77777777">
-            <w:pPr>
-              <w:suppressAutoHyphens w:val="0"/>
-              <w:spacing w:before="60" w:after="60"/>
-              <w:rPr>
-                <w:lang w:val="pt-BR" w:eastAsia="en-US"/>
-              </w:rPr>
-            </w:pPr>
-          </w:p>
-        </w:tc>
-        <w:tc>
-          <w:tcPr>
-            <w:tcW w:w="729" w:type="dxa"/>
-            <w:tcBorders>
-              <w:top w:val="dotted" w:color="auto" w:sz="4" w:space="0"/>
-              <w:left w:val="single" w:color="auto" w:sz="4" w:space="0"/>
-              <w:bottom w:val="dotted" w:color="auto" w:sz="4" w:space="0"/>
-              <w:right w:val="single" w:color="auto" w:sz="4" w:space="0"/>
-            </w:tcBorders>
-            <w:tcMar/>
-          </w:tcPr>
-          <w:p wp14:textId="77777777">
-            <w:pPr>
-              <w:suppressAutoHyphens w:val="0"/>
-              <w:spacing w:before="60" w:after="60"/>
-              <w:rPr>
-                <w:lang w:val="pt-BR" w:eastAsia="en-US"/>
-              </w:rPr>
-            </w:pPr>
-          </w:p>
-        </w:tc>
-        <w:tc>
-          <w:tcPr>
-            <w:tcW w:w="2084" w:type="dxa"/>
-            <w:tcBorders>
-              <w:top w:val="dotted" w:color="auto" w:sz="4" w:space="0"/>
-              <w:left w:val="single" w:color="auto" w:sz="4" w:space="0"/>
-              <w:bottom w:val="dotted" w:color="auto" w:sz="4" w:space="0"/>
-              <w:right w:val="single" w:color="auto" w:sz="4" w:space="0"/>
-            </w:tcBorders>
-            <w:tcMar/>
-          </w:tcPr>
-          <w:p wp14:textId="77777777">
-            <w:pPr>
-              <w:suppressAutoHyphens w:val="0"/>
-              <w:spacing w:before="60" w:after="60"/>
-              <w:rPr>
-                <w:lang w:val="pt-BR" w:eastAsia="en-US"/>
-              </w:rPr>
-            </w:pPr>
-          </w:p>
-        </w:tc>
-        <w:tc>
-          <w:tcPr>
-            <w:tcW w:w="1493" w:type="dxa"/>
-            <w:tcBorders>
-              <w:top w:val="dotted" w:color="auto" w:sz="4" w:space="0"/>
-              <w:left w:val="single" w:color="auto" w:sz="4" w:space="0"/>
-              <w:bottom w:val="dotted" w:color="auto" w:sz="4" w:space="0"/>
-              <w:right w:val="single" w:color="auto" w:sz="4" w:space="0"/>
-            </w:tcBorders>
-            <w:tcMar/>
-          </w:tcPr>
-          <w:p wp14:textId="77777777">
-            <w:pPr>
-              <w:suppressAutoHyphens w:val="0"/>
-              <w:spacing w:before="60" w:after="60"/>
-              <w:rPr>
-                <w:lang w:val="pt-BR" w:eastAsia="en-US"/>
-              </w:rPr>
-            </w:pPr>
+            <w:r>
+              <w:rPr>
+                <w:lang w:val="pt-BR" w:eastAsia="en-US"/>
+              </w:rPr>
+              <w:t>{</w:t>
+            </w:r>
+            <w:r>
+              <w:rPr>
+                <w:lang w:val="pt-BR" w:eastAsia="en-US"/>
+              </w:rPr>
+              <w:t>relationship</w:t>
+            </w:r>
+            <w:r>
+              <w:rPr>
+                <w:lang w:val="pt-BR" w:eastAsia="en-US"/>
+              </w:rPr>
+              <w:t>}</w:t>
+            </w:r>
+            <w:r>
+              <w:rPr>
+                <w:lang w:val="pt-BR" w:eastAsia="en-US"/>
+              </w:rPr>
+              <w:t xml:space="preserve"> {/</w:t>
+            </w:r>
+            <w:r>
+              <w:rPr>
+                <w:lang w:val="pt-BR" w:eastAsia="en-US"/>
+              </w:rPr>
+              <w:t>coOccupants</w:t>
+            </w:r>
+            <w:r>
+              <w:rPr>
+                <w:lang w:val="pt-BR" w:eastAsia="en-US"/>
+              </w:rPr>
+              <w:t>}</w:t>
+            </w:r>
           </w:p>
         </w:tc>
       </w:tr>
     </w:tbl>
+    <w:p/>
     <w:p xmlns:wp14="http://schemas.microsoft.com/office/word/2010/wordml" wp14:textId="77777777">
       <w:pPr>
         <w:tabs>
@@ -2820,12 +2168,12 @@
                 <w:iCs w:val="1"/>
                 <w:sz w:val="22"/>
                 <w:szCs w:val="22"/>
-                <w:lang w:val="pt-BR" w:eastAsia="en-US"/>
-              </w:rPr>
-            </w:pPr>
-            <w:r>
-              <w:rPr>
-                <w:lang w:val="pt-BR" w:eastAsia="en-US"/>
+                <w:lang w:val="en-US" w:eastAsia="en-US"/>
+              </w:rPr>
+            </w:pPr>
+            <w:r>
+              <w:rPr>
+                <w:lang w:val="en-US" w:eastAsia="en-US"/>
               </w:rPr>
               <w:t>...</w:t>
             </w:r>
@@ -2835,7 +2183,7 @@
                 <w:iCs w:val="1"/>
                 <w:sz w:val="22"/>
                 <w:szCs w:val="22"/>
-                <w:lang w:val="pt-BR" w:eastAsia="en-US"/>
+                <w:lang w:val="en-US" w:eastAsia="en-US"/>
               </w:rPr>
               <w:t>..</w:t>
             </w:r>
@@ -2845,7 +2193,7 @@
                 <w:iCs w:val="1"/>
                 <w:sz w:val="22"/>
                 <w:szCs w:val="22"/>
-                <w:lang w:val="pt-BR" w:eastAsia="en-US"/>
+                <w:lang w:val="en-US" w:eastAsia="en-US"/>
               </w:rPr>
               <w:t>,</w:t>
             </w:r>
@@ -2855,13 +2203,13 @@
                 <w:iCs w:val="1"/>
                 <w:sz w:val="22"/>
                 <w:szCs w:val="22"/>
-                <w:lang w:val="pt-BR" w:eastAsia="en-US"/>
+                <w:lang w:val="en-US" w:eastAsia="en-US"/>
               </w:rPr>
               <w:t>ngày</w:t>
             </w:r>
             <w:r>
               <w:rPr>
-                <w:lang w:val="pt-BR" w:eastAsia="en-US"/>
+                <w:lang w:val="en-US" w:eastAsia="en-US"/>
               </w:rPr>
               <w:t>...</w:t>
             </w:r>
@@ -2871,7 +2219,7 @@
                 <w:iCs w:val="1"/>
                 <w:sz w:val="22"/>
                 <w:szCs w:val="22"/>
-                <w:lang w:val="pt-BR" w:eastAsia="en-US"/>
+                <w:lang w:val="en-US" w:eastAsia="en-US"/>
               </w:rPr>
               <w:t>....</w:t>
             </w:r>
@@ -2881,7 +2229,7 @@
                 <w:iCs w:val="1"/>
                 <w:sz w:val="22"/>
                 <w:szCs w:val="22"/>
-                <w:lang w:val="pt-BR" w:eastAsia="en-US"/>
+                <w:lang w:val="en-US" w:eastAsia="en-US"/>
               </w:rPr>
               <w:t>tháng</w:t>
             </w:r>
@@ -2891,7 +2239,7 @@
                 <w:iCs w:val="1"/>
                 <w:sz w:val="22"/>
                 <w:szCs w:val="22"/>
-                <w:lang w:val="pt-BR" w:eastAsia="en-US"/>
+                <w:lang w:val="en-US" w:eastAsia="en-US"/>
               </w:rPr>
               <w:t>....</w:t>
             </w:r>
@@ -2901,13 +2249,13 @@
                 <w:iCs w:val="1"/>
                 <w:sz w:val="22"/>
                 <w:szCs w:val="22"/>
-                <w:lang w:val="pt-BR" w:eastAsia="en-US"/>
+                <w:lang w:val="en-US" w:eastAsia="en-US"/>
               </w:rPr>
               <w:t>năm</w:t>
             </w:r>
             <w:r>
               <w:rPr>
-                <w:lang w:val="pt-BR" w:eastAsia="en-US"/>
+                <w:lang w:val="en-US" w:eastAsia="en-US"/>
               </w:rPr>
               <w:t>.....</w:t>
             </w:r>

</xml_diff>